<commit_message>
Review-Korrekturen: faktische Fehler, fehlende Inhalte, Sprache
Verkaufsmappe:
- Kennzahlen aktualisiert (70 Models, 104 Migrationen, 85 Tabellen, 195+ Komponenten, ~377 Endpoints)
- PHP-Version korrigiert (8.3+ statt 8.4)
- Datentyp VideoLink ergänzt (12 → 13)
- Rollen API Designer und Project Management ergänzt (5 → 7)

Guide "Von 0 auf 100":
- Untertitel korrigiert (Ersteinrichtung statt Alltag)
- Produktstatus Discontinued ergänzt
- Datentyp VideoLink ergänzt
- Abschnitte Relationen und Versionierung hinzugefügt
- Import-Hinweis bei Produkterstellung ergänzt
- Sprachliche Korrekturen (Querverweis, Formulierungen)

https://claude.ai/code/session_01YHFZikX2P4HGMJz8r7apWi
</commit_message>
<xml_diff>
--- a/docs/guide-von-0-auf-100.docx
+++ b/docs/guide-von-0-auf-100.docx
@@ -21,7 +21,7 @@
           <w:color w:val="CDD6F4"/>
           <w:sz w:val="20"/>
         </w:rPr>
-        <w:t>Ein Praxisleitfaden für die tägliche Arbeit mit dem PIM.</w:t>
+        <w:t>Schritt für Schritt vom leeren System zum ersten Export.</w:t>
       </w:r>
     </w:p>
     <w:p>
@@ -54,7 +54,7 @@
           <w:color w:val="CDD6F4"/>
           <w:sz w:val="20"/>
         </w:rPr>
-        <w:t>Dieses Dokument setzt voraus, dass anyPIM installiert und erreichbar ist. Die Installation ist in der Verkaufs-Mappe (Kapitel 4) beschrieben.</w:t>
+        <w:t>Dieses Dokument setzt voraus, dass anyPIM installiert und erreichbar ist. Die Installation ist in der Verkaufs-Mappe beschrieben.</w:t>
       </w:r>
     </w:p>
     <w:p>
@@ -4466,6 +4466,59 @@
                 <w:sz w:val="17"/>
               </w:rPr>
               <w:t>Datenblatt-Link</w:t>
+            </w:r>
+          </w:p>
+        </w:tc>
+      </w:tr>
+      <w:tr>
+        <w:tc>
+          <w:tcPr>
+            <w:tcW w:type="dxa" w:w="3024"/>
+            <w:shd w:fill="252536"/>
+          </w:tcPr>
+          <w:p>
+            <w:r/>
+            <w:r>
+              <w:rPr>
+                <w:rFonts w:ascii="Calibri" w:hAnsi="Calibri"/>
+                <w:color w:val="CDD6F4"/>
+                <w:sz w:val="17"/>
+              </w:rPr>
+              <w:t>VideoLink</w:t>
+            </w:r>
+          </w:p>
+        </w:tc>
+        <w:tc>
+          <w:tcPr>
+            <w:tcW w:type="dxa" w:w="3024"/>
+            <w:shd w:fill="252536"/>
+          </w:tcPr>
+          <w:p>
+            <w:r/>
+            <w:r>
+              <w:rPr>
+                <w:rFonts w:ascii="Calibri" w:hAnsi="Calibri"/>
+                <w:color w:val="CDD6F4"/>
+                <w:sz w:val="17"/>
+              </w:rPr>
+              <w:t>Video-URL</w:t>
+            </w:r>
+          </w:p>
+        </w:tc>
+        <w:tc>
+          <w:tcPr>
+            <w:tcW w:type="dxa" w:w="3024"/>
+            <w:shd w:fill="252536"/>
+          </w:tcPr>
+          <w:p>
+            <w:r/>
+            <w:r>
+              <w:rPr>
+                <w:rFonts w:ascii="Calibri" w:hAnsi="Calibri"/>
+                <w:color w:val="CDD6F4"/>
+                <w:sz w:val="17"/>
+              </w:rPr>
+              <w:t>Produktvideo</w:t>
             </w:r>
           </w:p>
         </w:tc>
@@ -5789,6 +5842,28 @@
     </w:p>
     <w:p>
       <w:pPr>
+        <w:pStyle w:val="DarkBody"/>
+      </w:pPr>
+      <w:r>
+        <w:rPr>
+          <w:rFonts w:ascii="Calibri" w:hAnsi="Calibri"/>
+          <w:b/>
+          <w:color w:val="CDD6F4"/>
+          <w:sz w:val="20"/>
+        </w:rPr>
+        <w:t>Tipp: Massenimport.</w:t>
+      </w:r>
+      <w:r>
+        <w:rPr>
+          <w:rFonts w:ascii="Calibri" w:hAnsi="Calibri"/>
+          <w:color w:val="CDD6F4"/>
+          <w:sz w:val="20"/>
+        </w:rPr>
+        <w:t xml:space="preserve"> Für große Produktbestände müssen Sie nicht jedes Produkt einzeln anlegen. anyPIM bietet einen Excel-Import mit 14-Tab-Struktur (Sprachen, Einheiten, Attribute, Produkte, Varianten, Medien, Preise, ...). Details im Hilfe-Portal. In diesem Leitfaden zeigen wir den manuellen Weg, damit Sie die Zusammenhänge verstehen.</w:t>
+      </w:r>
+    </w:p>
+    <w:p>
+      <w:pPr>
         <w:pStyle w:val="DarkH3"/>
       </w:pPr>
       <w:r>
@@ -6185,7 +6260,7 @@
           <w:color w:val="CDD6F4"/>
           <w:sz w:val="20"/>
         </w:rPr>
-        <w:t xml:space="preserve">Speichern mit </w:t>
+        <w:t xml:space="preserve">Speichern mit dem Button </w:t>
       </w:r>
       <w:r>
         <w:rPr>
@@ -6280,17 +6355,128 @@
           <w:color w:val="A6E3A1"/>
           <w:sz w:val="17"/>
         </w:rPr>
-        <w:t xml:space="preserve">                         ↓</w:t>
+        <w:t xml:space="preserve">                    →  Eingestellt (Discontinued)</w:t>
         <w:br/>
+      </w:r>
+    </w:p>
+    <w:p>
+      <w:pPr>
+        <w:pStyle w:val="DarkBullet"/>
+        <w:ind w:left="567" w:hanging="283"/>
+      </w:pPr>
+      <w:r>
+        <w:rPr>
+          <w:color w:val="89B4FA"/>
+          <w:sz w:val="20"/>
+        </w:rPr>
+        <w:t xml:space="preserve">  </w:t>
       </w:r>
       <w:r>
         <w:rPr>
-          <w:rFonts w:ascii="Courier New" w:hAnsi="Courier New"/>
-          <w:color w:val="A6E3A1"/>
-          <w:sz w:val="17"/>
+          <w:rFonts w:ascii="Calibri" w:hAnsi="Calibri"/>
+          <w:b/>
+          <w:color w:val="CDD6F4"/>
+          <w:sz w:val="20"/>
         </w:rPr>
-        <w:t xml:space="preserve">                      Entwurf</w:t>
-        <w:br/>
+        <w:t>Entwurf:</w:t>
+      </w:r>
+      <w:r>
+        <w:rPr>
+          <w:rFonts w:ascii="Calibri" w:hAnsi="Calibri"/>
+          <w:color w:val="CDD6F4"/>
+          <w:sz w:val="20"/>
+        </w:rPr>
+        <w:t xml:space="preserve"> Produkt wird bearbeitet, noch nicht sichtbar</w:t>
+      </w:r>
+    </w:p>
+    <w:p>
+      <w:pPr>
+        <w:pStyle w:val="DarkBullet"/>
+        <w:ind w:left="567" w:hanging="283"/>
+      </w:pPr>
+      <w:r>
+        <w:rPr>
+          <w:color w:val="89B4FA"/>
+          <w:sz w:val="20"/>
+        </w:rPr>
+        <w:t xml:space="preserve">  </w:t>
+      </w:r>
+      <w:r>
+        <w:rPr>
+          <w:rFonts w:ascii="Calibri" w:hAnsi="Calibri"/>
+          <w:b/>
+          <w:color w:val="CDD6F4"/>
+          <w:sz w:val="20"/>
+        </w:rPr>
+        <w:t>Aktiv:</w:t>
+      </w:r>
+      <w:r>
+        <w:rPr>
+          <w:rFonts w:ascii="Calibri" w:hAnsi="Calibri"/>
+          <w:color w:val="CDD6F4"/>
+          <w:sz w:val="20"/>
+        </w:rPr>
+        <w:t xml:space="preserve"> Produkt wird exportiert und ist in Katalogen sichtbar</w:t>
+      </w:r>
+    </w:p>
+    <w:p>
+      <w:pPr>
+        <w:pStyle w:val="DarkBullet"/>
+        <w:ind w:left="567" w:hanging="283"/>
+      </w:pPr>
+      <w:r>
+        <w:rPr>
+          <w:color w:val="89B4FA"/>
+          <w:sz w:val="20"/>
+        </w:rPr>
+        <w:t xml:space="preserve">  </w:t>
+      </w:r>
+      <w:r>
+        <w:rPr>
+          <w:rFonts w:ascii="Calibri" w:hAnsi="Calibri"/>
+          <w:b/>
+          <w:color w:val="CDD6F4"/>
+          <w:sz w:val="20"/>
+        </w:rPr>
+        <w:t>Inaktiv:</w:t>
+      </w:r>
+      <w:r>
+        <w:rPr>
+          <w:rFonts w:ascii="Calibri" w:hAnsi="Calibri"/>
+          <w:color w:val="CDD6F4"/>
+          <w:sz w:val="20"/>
+        </w:rPr>
+        <w:t xml:space="preserve"> Temporär deaktiviert, kann reaktiviert werden</w:t>
+      </w:r>
+    </w:p>
+    <w:p>
+      <w:pPr>
+        <w:pStyle w:val="DarkBullet"/>
+        <w:ind w:left="567" w:hanging="283"/>
+      </w:pPr>
+      <w:r>
+        <w:rPr>
+          <w:color w:val="89B4FA"/>
+          <w:sz w:val="20"/>
+        </w:rPr>
+        <w:t xml:space="preserve">  </w:t>
+      </w:r>
+      <w:r>
+        <w:rPr>
+          <w:rFonts w:ascii="Calibri" w:hAnsi="Calibri"/>
+          <w:b/>
+          <w:color w:val="CDD6F4"/>
+          <w:sz w:val="20"/>
+        </w:rPr>
+        <w:t>Eingestellt:</w:t>
+      </w:r>
+      <w:r>
+        <w:rPr>
+          <w:rFonts w:ascii="Calibri" w:hAnsi="Calibri"/>
+          <w:color w:val="CDD6F4"/>
+          <w:sz w:val="20"/>
+        </w:rPr>
+        <w:t xml:space="preserve"> Dauerhaft aus dem Sortiment genommen</w:t>
       </w:r>
     </w:p>
     <w:p>
@@ -6594,6 +6780,229 @@
         </w:tc>
       </w:tr>
     </w:tbl>
+    <w:p>
+      <w:pPr>
+        <w:pStyle w:val="DarkH3"/>
+      </w:pPr>
+      <w:r>
+        <w:t>Relationen</w:t>
+      </w:r>
+    </w:p>
+    <w:p>
+      <w:pPr>
+        <w:pStyle w:val="DarkBody"/>
+      </w:pPr>
+      <w:r>
+        <w:rPr>
+          <w:rFonts w:ascii="Calibri" w:hAnsi="Calibri"/>
+          <w:color w:val="CDD6F4"/>
+          <w:sz w:val="20"/>
+        </w:rPr>
+        <w:t xml:space="preserve">Über den Tab </w:t>
+      </w:r>
+      <w:r>
+        <w:rPr>
+          <w:rFonts w:ascii="Calibri" w:hAnsi="Calibri"/>
+          <w:b/>
+          <w:color w:val="CDD6F4"/>
+          <w:sz w:val="20"/>
+        </w:rPr>
+        <w:t>Relationen</w:t>
+      </w:r>
+      <w:r>
+        <w:rPr>
+          <w:rFonts w:ascii="Calibri" w:hAnsi="Calibri"/>
+          <w:color w:val="CDD6F4"/>
+          <w:sz w:val="20"/>
+        </w:rPr>
+        <w:t xml:space="preserve"> verknüpfen Sie Produkte miteinander. Typische Anwendungsfälle:</w:t>
+      </w:r>
+    </w:p>
+    <w:p>
+      <w:pPr>
+        <w:pStyle w:val="DarkBullet"/>
+        <w:ind w:left="567" w:hanging="283"/>
+      </w:pPr>
+      <w:r>
+        <w:rPr>
+          <w:color w:val="89B4FA"/>
+          <w:sz w:val="20"/>
+        </w:rPr>
+        <w:t xml:space="preserve">  </w:t>
+      </w:r>
+      <w:r>
+        <w:rPr>
+          <w:rFonts w:ascii="Calibri" w:hAnsi="Calibri"/>
+          <w:b/>
+          <w:color w:val="CDD6F4"/>
+          <w:sz w:val="20"/>
+        </w:rPr>
+        <w:t>Zubehör:</w:t>
+      </w:r>
+      <w:r>
+        <w:rPr>
+          <w:rFonts w:ascii="Calibri" w:hAnsi="Calibri"/>
+          <w:color w:val="CDD6F4"/>
+          <w:sz w:val="20"/>
+        </w:rPr>
+        <w:t xml:space="preserve"> Bohrer als Zubehör zur Bohrmaschine</w:t>
+      </w:r>
+    </w:p>
+    <w:p>
+      <w:pPr>
+        <w:pStyle w:val="DarkBullet"/>
+        <w:ind w:left="567" w:hanging="283"/>
+      </w:pPr>
+      <w:r>
+        <w:rPr>
+          <w:color w:val="89B4FA"/>
+          <w:sz w:val="20"/>
+        </w:rPr>
+        <w:t xml:space="preserve">  </w:t>
+      </w:r>
+      <w:r>
+        <w:rPr>
+          <w:rFonts w:ascii="Calibri" w:hAnsi="Calibri"/>
+          <w:b/>
+          <w:color w:val="CDD6F4"/>
+          <w:sz w:val="20"/>
+        </w:rPr>
+        <w:t>Ersatzteile:</w:t>
+      </w:r>
+      <w:r>
+        <w:rPr>
+          <w:rFonts w:ascii="Calibri" w:hAnsi="Calibri"/>
+          <w:color w:val="CDD6F4"/>
+          <w:sz w:val="20"/>
+        </w:rPr>
+        <w:t xml:space="preserve"> Kohlebürsten als Ersatzteil</w:t>
+      </w:r>
+    </w:p>
+    <w:p>
+      <w:pPr>
+        <w:pStyle w:val="DarkBullet"/>
+        <w:ind w:left="567" w:hanging="283"/>
+      </w:pPr>
+      <w:r>
+        <w:rPr>
+          <w:color w:val="89B4FA"/>
+          <w:sz w:val="20"/>
+        </w:rPr>
+        <w:t xml:space="preserve">  </w:t>
+      </w:r>
+      <w:r>
+        <w:rPr>
+          <w:rFonts w:ascii="Calibri" w:hAnsi="Calibri"/>
+          <w:b/>
+          <w:color w:val="CDD6F4"/>
+          <w:sz w:val="20"/>
+        </w:rPr>
+        <w:t>Cross-Selling:</w:t>
+      </w:r>
+      <w:r>
+        <w:rPr>
+          <w:rFonts w:ascii="Calibri" w:hAnsi="Calibri"/>
+          <w:color w:val="CDD6F4"/>
+          <w:sz w:val="20"/>
+        </w:rPr>
+        <w:t xml:space="preserve"> Ähnliche Produkte aus einer anderen Kategorie</w:t>
+      </w:r>
+    </w:p>
+    <w:p>
+      <w:pPr>
+        <w:pStyle w:val="DarkBody"/>
+      </w:pPr>
+      <w:r>
+        <w:rPr>
+          <w:rFonts w:ascii="Calibri" w:hAnsi="Calibri"/>
+          <w:b/>
+          <w:color w:val="CDD6F4"/>
+          <w:sz w:val="20"/>
+        </w:rPr>
+        <w:t>Produktdetail → Tab "Relationen" → + Relation hinzufügen</w:t>
+      </w:r>
+    </w:p>
+    <w:p>
+      <w:pPr>
+        <w:pStyle w:val="DarkBody"/>
+      </w:pPr>
+      <w:r>
+        <w:rPr>
+          <w:rFonts w:ascii="Calibri" w:hAnsi="Calibri"/>
+          <w:color w:val="CDD6F4"/>
+          <w:sz w:val="20"/>
+        </w:rPr>
+        <w:t>Wählen Sie den Relationstyp und das Zielprodukt. Relationen können einseitig oder beidseitig sein.</w:t>
+      </w:r>
+    </w:p>
+    <w:p>
+      <w:pPr>
+        <w:pStyle w:val="DarkH3"/>
+      </w:pPr>
+      <w:r>
+        <w:t>Versionen</w:t>
+      </w:r>
+    </w:p>
+    <w:p>
+      <w:pPr>
+        <w:pStyle w:val="DarkBody"/>
+      </w:pPr>
+      <w:r>
+        <w:rPr>
+          <w:rFonts w:ascii="Calibri" w:hAnsi="Calibri"/>
+          <w:color w:val="CDD6F4"/>
+          <w:sz w:val="20"/>
+        </w:rPr>
+        <w:t xml:space="preserve">Jede Speicherung erzeugt automatisch eine neue Version. Über den Tab </w:t>
+      </w:r>
+      <w:r>
+        <w:rPr>
+          <w:rFonts w:ascii="Calibri" w:hAnsi="Calibri"/>
+          <w:b/>
+          <w:color w:val="CDD6F4"/>
+          <w:sz w:val="20"/>
+        </w:rPr>
+        <w:t>Versionen</w:t>
+      </w:r>
+      <w:r>
+        <w:rPr>
+          <w:rFonts w:ascii="Calibri" w:hAnsi="Calibri"/>
+          <w:color w:val="CDD6F4"/>
+          <w:sz w:val="20"/>
+        </w:rPr>
+        <w:t xml:space="preserve"> sehen Sie die komplette Änderungshistorie: Wer hat wann welche Werte geändert?</w:t>
+      </w:r>
+    </w:p>
+    <w:p>
+      <w:pPr>
+        <w:pStyle w:val="DarkBody"/>
+      </w:pPr>
+      <w:r>
+        <w:rPr>
+          <w:rFonts w:ascii="Calibri" w:hAnsi="Calibri"/>
+          <w:color w:val="CDD6F4"/>
+          <w:sz w:val="20"/>
+        </w:rPr>
+        <w:t xml:space="preserve">Um eine ältere Version wiederherzustellen: Version auswählen und </w:t>
+      </w:r>
+      <w:r>
+        <w:rPr>
+          <w:rFonts w:ascii="Calibri" w:hAnsi="Calibri"/>
+          <w:b/>
+          <w:color w:val="CDD6F4"/>
+          <w:sz w:val="20"/>
+        </w:rPr>
+        <w:t>Wiederherstellen</w:t>
+      </w:r>
+      <w:r>
+        <w:rPr>
+          <w:rFonts w:ascii="Calibri" w:hAnsi="Calibri"/>
+          <w:color w:val="CDD6F4"/>
+          <w:sz w:val="20"/>
+        </w:rPr>
+        <w:t xml:space="preserve"> klicken. Die aktuelle Version wird dabei nicht gelöscht — es entsteht eine neue Version mit den alten Werten.</w:t>
+      </w:r>
+    </w:p>
     <w:p>
       <w:pPr>
         <w:spacing w:before="160" w:after="160"/>
@@ -8553,7 +8962,7 @@
           <w:color w:val="CDD6F4"/>
           <w:sz w:val="20"/>
         </w:rPr>
-        <w:t xml:space="preserve"> — Automatische Übersetzung über DeepL, Google Translate oder Claude</w:t>
+        <w:t xml:space="preserve"> — Automatische Übersetzung über DeepL, Google Translate oder KI-gestützte Übersetzung</w:t>
       </w:r>
     </w:p>
     <w:p>
@@ -9569,7 +9978,7 @@
           <w:color w:val="CDD6F4"/>
           <w:sz w:val="20"/>
         </w:rPr>
-        <w:t xml:space="preserve"> Weitere Benutzer einladen und Rollen zuweisen. Siehe Verkaufs-Mappe, Kapitel 6.</w:t>
+        <w:t xml:space="preserve"> Weitere Benutzer einladen und Rollen zuweisen. Siehe Verkaufs-Mappe.</w:t>
       </w:r>
     </w:p>
     <w:p>
@@ -9599,7 +10008,7 @@
           <w:color w:val="CDD6F4"/>
           <w:sz w:val="20"/>
         </w:rPr>
-        <w:t xml:space="preserve"> Aufgaben erstellen und im Team koordinieren. Siehe Verkaufs-Mappe, Kapitel 7.</w:t>
+        <w:t xml:space="preserve"> Aufgaben erstellen und im Team koordinieren. Siehe Verkaufs-Mappe.</w:t>
       </w:r>
     </w:p>
     <w:p>

</xml_diff>